<commit_message>
Invoices and emails generated, need polishing
</commit_message>
<xml_diff>
--- a/output/Invoice-LATA Pandey-2025-09-25-26.docx
+++ b/output/Invoice-LATA Pandey-2025-09-25-26.docx
@@ -550,7 +550,7 @@
                 <w:sz w:val="24"/>
                 <w:szCs w:val="24"/>
               </w:rPr>
-              <w:t xml:space="preserve">2025-09 </w:t>
+              <w:t xml:space="preserve">SEP </w:t>
             </w:r>
             <w:r>
               <w:rPr>
@@ -630,7 +630,7 @@
                 <w:sz w:val="24"/>
                 <w:szCs w:val="24"/>
               </w:rPr>
-              <w:t xml:space="preserve">BILL NO: 25-26/06/2025-09</w:t>
+              <w:t xml:space="preserve">BILL NO: 25-26/01/2025-09</w:t>
             </w:r>
             <w:proofErr w:type="spellStart"/>
             <w:r>
@@ -668,7 +668,7 @@
                 <w:sz w:val="24"/>
                 <w:szCs w:val="24"/>
               </w:rPr>
-              <w:t xml:space="preserve">DATE : 20 Sept 2025</w:t>
+              <w:t xml:space="preserve">DATE : 27 Sept 2025</w:t>
             </w:r>
           </w:p>
         </w:tc>
@@ -758,7 +758,7 @@
                 <w:sz w:val="24"/>
                 <w:szCs w:val="24"/>
               </w:rPr>
-              <w:t xml:space="preserve">RENT FOR THE MONTH OF 2025-09</w:t>
+              <w:t xml:space="preserve">RENT FOR THE MONTH OF SEP</w:t>
             </w:r>
             <w:r>
               <w:rPr>
@@ -909,7 +909,7 @@
                 <w:sz w:val="20"/>
                 <w:szCs w:val="20"/>
               </w:rPr>
-              <w:t xml:space="preserve">5000</w:t>
+              <w:t xml:space="preserve">6969</w:t>
             </w:r>
           </w:p>
         </w:tc>
@@ -941,7 +941,7 @@
                 <w:sz w:val="24"/>
                 <w:szCs w:val="24"/>
               </w:rPr>
-              <w:t xml:space="preserve">(Rupees FIVE THOUSAND Only</w:t>
+              <w:t xml:space="preserve">(Rupees SIX THOUSAND, NINE HUNDRED SIXTY-NINE Only</w:t>
             </w:r>
             <w:proofErr w:type="spellStart"/>
             <w:r>

</xml_diff>